<commit_message>
Chinese font bug fixed, changed log format
prebuild new Chinese character atlas while reading. fixed a translation bug
</commit_message>
<xml_diff>
--- a/Research Proposal.docx
+++ b/Research Proposal.docx
@@ -845,6 +845,7 @@
               <w:rPr>
                 <w:sz w:val="19"/>
               </w:rPr>
+              <w:lastRenderedPageBreak/>
               <w:t>TopK</w:t>
             </w:r>
           </w:p>
@@ -934,7 +935,6 @@
         <w:pStyle w:val="Heading2"/>
       </w:pPr>
       <w:r>
-        <w:lastRenderedPageBreak/>
         <w:t>3.3 Dialogue-Model Capability Assumption</w:t>
       </w:r>
     </w:p>
@@ -992,6 +992,7 @@
         </w:numPr>
       </w:pPr>
       <w:r>
+        <w:lastRenderedPageBreak/>
         <w:t>H3: Model-assisted importance retrieval will receive higher human ratings for contextual and personality-relevant memory use than rule-based importance retrieval, while incurring an additional one-time pre-boss scoring cost. No directional hypothesis is made for cached online retrieval latency.</w:t>
       </w:r>
     </w:p>
@@ -1012,13 +1013,11 @@
       </w:r>
     </w:p>
     <w:p>
-      <w:pPr/>
       <w:r>
         <w:t>The implemented runtime separates three information paths. Fixed static context is authored in DialogueGenerator and inserted directly into every generated dialogue prompt. Participant-specific long-term episodic memories are generated from completed minor encounters, stored in MemorySystem, and passed through the active retrieval strategy. Encounter-local working memory is held by BossDialogueDirector for the current boss attempt and enters the prompt without embedding, importance scoring, or persistence.</w:t>
       </w:r>
     </w:p>
     <w:p>
-      <w:pPr/>
       <w:r>
         <w:t>Runtime flow: Unity gameplay events -&gt; atomic MemoryEventData -&gt; persistent MemorySystem pool -&gt; pre-boss embedding and optional model-score preparation -&gt; condition-specific TopK retrieval -&gt; fixed prompt plus static and working context -&gt; dialogue proxy -&gt; DialogueBubbleManager.</w:t>
       </w:r>
@@ -1052,7 +1051,11 @@
         <w:pStyle w:val="ListParagraph"/>
       </w:pPr>
       <w:r>
-        <w:t>MemorySystem assigns stable identifiers, stores structured metrics and English factual text, and clears both long-term memories and cached model scores at the start of a new full run. Working memories and boss trigger state are reset when a boss attempt is configured or retried.</w:t>
+        <w:t xml:space="preserve">MemorySystem assigns stable identifiers, stores structured metrics and English factual text, and </w:t>
+      </w:r>
+      <w:r>
+        <w:lastRenderedPageBreak/>
+        <w:t>clears both long-term memories and cached model scores at the start of a new full run. Working memories and boss trigger state are reset when a boss attempt is configured or retried.</w:t>
       </w:r>
     </w:p>
     <w:p>
@@ -1124,6 +1127,7 @@
         <w:pStyle w:val="ListParagraph"/>
       </w:pPr>
       <w:r>
+        <w:lastRenderedPageBreak/>
         <w:t>BossDialogueDirector applies the common trigger policy for encounter start, alternating boss-turn intervals, notable player-turn outcomes, health thresholds, the first tactical minion defeat, and battle end. A three-second cooldown suppresses nearby ordinary triggers. Battle-end dialogue has priority: active ordinary dialogue requests are aborted, stale request versions cannot update the bubble, and no new ordinary request is accepted after the end request begins.</w:t>
       </w:r>
     </w:p>
@@ -1196,6 +1200,7 @@
         <w:pStyle w:val="ListParagraph"/>
       </w:pPr>
       <w:r>
+        <w:lastRenderedPageBreak/>
         <w:t>Configure the Qualtrics questionnaire and a participant-safe procedure for collecting session-linked retrieval traces and dialogue outputs needed for offline relevance and dialogue coding. Exact API token usage remains optional; prompt characters and UTF-8 bytes are already available as context-size proxies.</w:t>
       </w:r>
     </w:p>
@@ -1272,7 +1277,6 @@
                 <w:b/>
                 <w:sz w:val="19"/>
               </w:rPr>
-              <w:lastRenderedPageBreak/>
               <w:t>Field</w:t>
             </w:r>
           </w:p>
@@ -1480,6 +1484,7 @@
               <w:rPr>
                 <w:sz w:val="19"/>
               </w:rPr>
+              <w:lastRenderedPageBreak/>
               <w:t>Text</w:t>
             </w:r>
           </w:p>
@@ -1669,7 +1674,6 @@
           </w:tcPr>
           <w:p>
             <w:r>
-              <w:lastRenderedPageBreak/>
               <w:t>Category</w:t>
             </w:r>
           </w:p>
@@ -1784,6 +1788,7 @@
           </w:tcPr>
           <w:p>
             <w:r>
+              <w:lastRenderedPageBreak/>
               <w:t>EncounterDuration</w:t>
             </w:r>
           </w:p>
@@ -2218,6 +2223,7 @@
           </w:tcPr>
           <w:p>
             <w:r>
+              <w:lastRenderedPageBreak/>
               <w:t>EncounterDuration</w:t>
             </w:r>
           </w:p>
@@ -2257,7 +2263,6 @@
           </w:tcPr>
           <w:p>
             <w:r>
-              <w:lastRenderedPageBreak/>
               <w:t>FinalHealth</w:t>
             </w:r>
           </w:p>
@@ -2419,16 +2424,16 @@
     </w:p>
     <w:p>
       <w:r>
-        <w:t>The scoring client validates the response against the dynamic memory pool rather than assuming a fixed record count. Valid scores are kept in a separate ModelImportanceScoreCache and are not stored as immutable human ground truth in MemoryRecord. If a memory lacks a valid cached score when Model-assisted retrieval runs, the system retries scoring for the missing records before ranking.</w:t>
-      </w:r>
-    </w:p>
-    <w:p>
-      <w:r>
-        <w:t xml:space="preserve">For online ranking, model importance is divided by 2 and combined with normalised cosine similarity using FinalScore(m) = 0.7 * NormalisedSimilarity(m) + 0.3 * ModelImportance(m). The scorer prompt and model </w:t>
+        <w:t xml:space="preserve">The scoring client validates the response against the dynamic memory pool rather than assuming a fixed </w:t>
       </w:r>
       <w:r>
         <w:lastRenderedPageBreak/>
-        <w:t>configuration are fixed across conditions, and human relevance labels are used only for evaluation. Batch-scoring latency, success, scored count, and errors are logged separately; online traces record each cached score, reason, cache-hit state, error, and final rank.</w:t>
+        <w:t>record count. Valid scores are kept in a separate ModelImportanceScoreCache and are not stored as immutable human ground truth in MemoryRecord. If a memory lacks a valid cached score when Model-assisted retrieval runs, the system retries scoring for the missing records before ranking.</w:t>
+      </w:r>
+    </w:p>
+    <w:p>
+      <w:r>
+        <w:t>For online ranking, model importance is divided by 2 and combined with normalised cosine similarity using FinalScore(m) = 0.7 * NormalisedSimilarity(m) + 0.3 * ModelImportance(m). The scorer prompt and model configuration are fixed across conditions, and human relevance labels are used only for evaluation. Batch-scoring latency, success, scored count, and errors are logged separately; online traces record each cached score, reason, cache-hit state, error, and final rank.</w:t>
       </w:r>
     </w:p>
     <w:p>
@@ -2795,6 +2800,7 @@
         <w:pStyle w:val="Heading2"/>
       </w:pPr>
       <w:r>
+        <w:lastRenderedPageBreak/>
         <w:t>9.3 Boss Dialogue Triggers</w:t>
       </w:r>
     </w:p>
@@ -2860,7 +2866,6 @@
         </w:numPr>
       </w:pPr>
       <w:r>
-        <w:lastRenderedPageBreak/>
         <w:t>Player health first falls below 50% or 25%.</w:t>
       </w:r>
     </w:p>
@@ -3020,6 +3025,7 @@
                 <w:b/>
                 <w:sz w:val="19"/>
               </w:rPr>
+              <w:lastRenderedPageBreak/>
               <w:t>Output code</w:t>
             </w:r>
           </w:p>
@@ -3234,7 +3240,6 @@
               <w:rPr>
                 <w:sz w:val="19"/>
               </w:rPr>
-              <w:lastRenderedPageBreak/>
               <w:t>Hallucination</w:t>
             </w:r>
           </w:p>
@@ -3453,7 +3458,7 @@
       <w:tr>
         <w:tc>
           <w:tcPr>
-            <w:tcW w:type="dxa" w:w="2592"/>
+            <w:tcW w:w="2592" w:type="dxa"/>
           </w:tcPr>
           <w:p>
             <w:r>
@@ -3463,7 +3468,7 @@
         </w:tc>
         <w:tc>
           <w:tcPr>
-            <w:tcW w:type="dxa" w:w="6768"/>
+            <w:tcW w:w="6768" w:type="dxa"/>
           </w:tcPr>
           <w:p>
             <w:r>
@@ -3730,7 +3735,11 @@
         <w:pStyle w:val="ListParagraph"/>
       </w:pPr>
       <w:r>
-        <w:t>System evaluation separates one-time boss-preparation work from trigger-time dialogue response. Model-scoring batch latency and embedding prewarm are reported independently from cached online retrieval latency, dialogue-generation latency, and end-to-end latency. Per-condition trigger and successful-output counts are reported because naturally different player actions may expose different dialogue events, but the three conditions retain the same trigger definitions.</w:t>
+        <w:t xml:space="preserve">System evaluation separates one-time boss-preparation work from trigger-time dialogue response. Model-scoring batch latency and embedding prewarm are reported independently from cached online retrieval latency, dialogue-generation latency, and end-to-end latency. Per-condition trigger </w:t>
+      </w:r>
+      <w:r>
+        <w:lastRenderedPageBreak/>
+        <w:t>and successful-output counts are reported because naturally different player actions may expose different dialogue events, but the three conditions retain the same trigger definitions.</w:t>
       </w:r>
     </w:p>
     <w:p>
@@ -3790,7 +3799,6 @@
         </w:numPr>
       </w:pPr>
       <w:r>
-        <w:lastRenderedPageBreak/>
         <w:t>Conditions use blind labels A/B/C and a three-sequence Latin-square order assigned before the boss encounters.</w:t>
       </w:r>
     </w:p>
@@ -3926,6 +3934,35 @@
       </w:r>
     </w:p>
     <w:p>
+      <w:pPr>
+        <w:pStyle w:val="Heading2"/>
+        <w:rPr>
+          <w:rFonts w:hint="eastAsia"/>
+        </w:rPr>
+      </w:pPr>
+      <w:r>
+        <w:t>12.</w:t>
+      </w:r>
+      <w:r>
+        <w:rPr>
+          <w:rFonts w:hint="eastAsia"/>
+        </w:rPr>
+        <w:t>2</w:t>
+      </w:r>
+      <w:r>
+        <w:t xml:space="preserve"> Boss </w:t>
+      </w:r>
+      <w:r>
+        <w:rPr>
+          <w:rFonts w:hint="eastAsia"/>
+        </w:rPr>
+        <w:t xml:space="preserve">Personality </w:t>
+      </w:r>
+      <w:r>
+        <w:t>Reorganization</w:t>
+      </w:r>
+    </w:p>
+    <w:p>
       <w:r>
         <w:t>Personality recognition question: Which description best represents the boss's personality?</w:t>
       </w:r>
@@ -3987,7 +4024,16 @@
         <w:pStyle w:val="Heading2"/>
       </w:pPr>
       <w:r>
-        <w:t>12.2 Comparative Questions</w:t>
+        <w:t>12.</w:t>
+      </w:r>
+      <w:r>
+        <w:rPr>
+          <w:rFonts w:hint="eastAsia"/>
+        </w:rPr>
+        <w:t>3</w:t>
+      </w:r>
+      <w:r>
+        <w:t xml:space="preserve"> Comparative Questions</w:t>
       </w:r>
     </w:p>
     <w:p>
@@ -4084,16 +4130,13 @@
         <w:pStyle w:val="Heading1"/>
       </w:pPr>
       <w:r>
+        <w:lastRenderedPageBreak/>
         <w:t>13. Analysis Plan</w:t>
       </w:r>
     </w:p>
     <w:p>
       <w:r>
-        <w:t xml:space="preserve">Questionnaire dimensions will be summarised across the three retrieval conditions using medians, </w:t>
-      </w:r>
-      <w:r>
-        <w:lastRenderedPageBreak/>
-        <w:t>distributions, and within-participant comparisons. Given the prototype sample size, statistical results will be reported cautiously alongside effect sizes and qualitative comments. Retrieval metrics, explanation traces, human dialogue codes, and system-performance logs will be analysed separately before being interpreted together. Full-memory and Scripted development runs will not enter the formal statistical comparison. A retrieval strategy will not be considered successful solely because it returns different memories; it must demonstrate improved ranking relevance, dialogue use, explainability, latency, or a clearly reported trade-off among these outcomes.</w:t>
+        <w:t>Questionnaire dimensions will be summarised across the three retrieval conditions using medians, distributions, and within-participant comparisons. Given the prototype sample size, statistical results will be reported cautiously alongside effect sizes and qualitative comments. Retrieval metrics, explanation traces, human dialogue codes, and system-performance logs will be analysed separately before being interpreted together. Full-memory and Scripted development runs will not enter the formal statistical comparison. A retrieval strategy will not be considered successful solely because it returns different memories; it must demonstrate improved ranking relevance, dialogue use, explainability, latency, or a clearly reported trade-off among these outcomes.</w:t>
       </w:r>
     </w:p>
     <w:p>
@@ -4442,6 +4485,7 @@
               <w:rPr>
                 <w:sz w:val="19"/>
               </w:rPr>
+              <w:lastRenderedPageBreak/>
               <w:t>6. Analysis and writing</w:t>
             </w:r>
           </w:p>
@@ -4504,7 +4548,6 @@
         </w:numPr>
       </w:pPr>
       <w:r>
-        <w:lastRenderedPageBreak/>
         <w:t>Results are specific to one dialogue model, embedding model, game design, and prompt configuration.</w:t>
       </w:r>
     </w:p>
@@ -4684,7 +4727,11 @@
     </w:p>
     <w:p>
       <w:r>
-        <w:t>No additional generation or sampling fields are currently sent explicitly. Temperature is omitted and therefore uses the provider default of 1.0. No explicit max_tokens limit is supplied, so the provider/model default limit applies. This is an intentional fixed request policy rather than an attempt to control selected optional parameters individually. The same model version, proxy payload structure, and explicitly supplied fields will be used for every formal condition. Actual completion-token usage will be recorded where it is returned by the API and exposed by the proxy; prompt characters and UTF-8 bytes remain fallback size measures. If pilot responses repeatedly end at the same completion-token count with finish_reason = length, a sufficiently larger provider-supported output limit will be set, documented, and frozen before formal data collection. This is not expected under the current instruction to generate no more than two short sentences. The study reports results for the complete deployed configuration and does not attribute an effect to any unspecified parameter value.</w:t>
+        <w:t xml:space="preserve">No additional generation or sampling fields are currently sent explicitly. Temperature is omitted and therefore uses the provider default of 1.0. No explicit max_tokens limit is supplied, so the provider/model default limit applies. This is an intentional fixed request policy rather than an attempt to control selected optional parameters individually. The same model version, proxy payload structure, and explicitly supplied fields will be used for every formal condition. Actual completion-token usage will be recorded where it is returned by the API and exposed by the proxy; prompt characters and UTF-8 bytes remain fallback size </w:t>
+      </w:r>
+      <w:r>
+        <w:lastRenderedPageBreak/>
+        <w:t>measures. If pilot responses repeatedly end at the same completion-token count with finish_reason = length, a sufficiently larger provider-supported output limit will be set, documented, and frozen before formal data collection. This is not expected under the current instruction to generate no more than two short sentences. The study reports results for the complete deployed configuration and does not attribute an effect to any unspecified parameter value.</w:t>
       </w:r>
     </w:p>
     <w:p>
@@ -4722,7 +4769,6 @@
         <w:rPr>
           <w:b/>
         </w:rPr>
-        <w:lastRenderedPageBreak/>
         <w:t xml:space="preserve">Rule-based importance: </w:t>
       </w:r>
       <w:r>
@@ -4790,7 +4836,11 @@
     </w:p>
     <w:p>
       <w:r>
-        <w:t>Values in braces are filled at runtime. The complete fixed wording is defined by DialogueGenerator.BuildPrompt.</w:t>
+        <w:t xml:space="preserve">Values in braces are filled at runtime. The complete fixed wording is defined by </w:t>
+      </w:r>
+      <w:r>
+        <w:lastRenderedPageBreak/>
+        <w:t>DialogueGenerator.BuildPrompt.</w:t>
       </w:r>
     </w:p>
     <w:p>
@@ -4896,13 +4946,6 @@
           <w:sz w:val="16"/>
         </w:rPr>
         <w:br/>
-      </w:r>
-      <w:r>
-        <w:rPr>
-          <w:rFonts w:ascii="Consolas" w:eastAsia="Consolas" w:hAnsi="Consolas"/>
-          <w:sz w:val="16"/>
-        </w:rPr>
-        <w:lastRenderedPageBreak/>
         <w:t>[MINION ENCOUNTER BACKGROUND]</w:t>
       </w:r>
       <w:r>
@@ -5107,6 +5150,7 @@
         <w:pStyle w:val="Heading2"/>
       </w:pPr>
       <w:r>
+        <w:lastRenderedPageBreak/>
         <w:t>A.5 Model-Assisted Scoring Prompt Example</w:t>
       </w:r>
     </w:p>
@@ -5196,13 +5240,6 @@
           <w:sz w:val="16"/>
         </w:rPr>
         <w:br/>
-      </w:r>
-      <w:r>
-        <w:rPr>
-          <w:rFonts w:ascii="Consolas" w:eastAsia="Consolas" w:hAnsi="Consolas"/>
-          <w:sz w:val="16"/>
-        </w:rPr>
-        <w:lastRenderedPageBreak/>
         <w:t>Score only the supplied atomic fact and judge importance independently from similarity.</w:t>
       </w:r>
       <w:r>
@@ -5317,7 +5354,11 @@
     </w:p>
     <w:p>
       <w:r>
-        <w:t>Li, Z., Li, C., Zhang, M., Mei, Q., &amp; Bendersky, M. (2024). Retrieval Augmented Generation or Long-Context LLMs? A Comprehensive Study and Hybrid Approach. EMNLP 2024 Industry Track, 881-893. https://doi.org/10.18653/v1/2024.emnlp-industry.66</w:t>
+        <w:t xml:space="preserve">Li, Z., Li, C., Zhang, M., Mei, Q., &amp; Bendersky, M. (2024). Retrieval Augmented Generation or Long-Context </w:t>
+      </w:r>
+      <w:r>
+        <w:lastRenderedPageBreak/>
+        <w:t>LLMs? A Comprehensive Study and Hybrid Approach. EMNLP 2024 Industry Track, 881-893. https://doi.org/10.18653/v1/2024.emnlp-industry.66</w:t>
       </w:r>
     </w:p>
     <w:p>

</xml_diff>